<commit_message>
feat: smarter resume generation with reviewer feedback
Major prompt rewrite based on parallel review by Opus/GPT-5.4/Sonnet:
- Extract 8-10 JD keywords before writing (not 15, avoids stuffing)
- WellMed enforced to 3 bullets minimum (picks most relevant)
- Professional Development section bridges the 2022-2024 gap
- Career positioning as consulting-to-SaaS transition story
- Achievement-focused bullets required (outcomes, not duties)
- Every bullet must have a number or measurable result
- Auto self-score + keyword coverage report in coaching note
- New section order: Summary > Skills > EY > WellMed > Prof Dev > Projects > Education
- Word export updated for PROFESSIONAL_DEVELOPMENT + EDUCATION_SECTION

Co-authored-by: Copilot <223556219+Copilot@users.noreply.github.com>
</commit_message>
<xml_diff>
--- a/public/resume-template.docx
+++ b/public/resume-template.docx
@@ -5,7 +5,7 @@
     <w:p>
       <w:pPr>
         <w:spacing w:line="240" w:lineRule="auto"/>
-        <w:ind w:left="-900" w:right="-810" w:firstLine="0"/>
+        <w:ind w:left="-900" w:right="-800" w:firstLine="0"/>
         <w:rPr>
           <w:rFonts w:ascii="Montserrat" w:cs="Montserrat" w:eastAsia="Montserrat" w:hAnsi="Montserrat"/>
           <w:b w:val="1"/>
@@ -1434,7 +1434,7 @@
     </w:p>
     <w:sectPr>
       <w:pgSz w:h="15840" w:w="12240" w:orient="portrait"/>
-      <w:pgMar w:bottom="180" w:top="540" w:left="1710" w:right="1260" w:header="720" w:footer="720"/>
+      <w:pgMar w:bottom="180" w:top="540" w:left="1620" w:right="1530" w:header="720" w:footer="720"/>
       <w:pgNumType w:start="1"/>
     </w:sectPr>
   </w:body>

</xml_diff>

<commit_message>
fix: summary as single paragraph, remove markdown bold, strip **
- Summary outputs on one line (no line breaks between sentences)
- Word export joins SUMMARY_SECTION into single paragraph instead of cloning
- Removed **bold** markdown from skills (Word template handles bold)
- Strip ** from all text before inserting into Word XML

Co-authored-by: Copilot <223556219+Copilot@users.noreply.github.com>
</commit_message>
<xml_diff>
--- a/public/resume-template.docx
+++ b/public/resume-template.docx
@@ -638,7 +638,37 @@
           <w:sz w:val="16"/>
           <w:szCs w:val="16"/>
         </w:rPr>
-        <w:t xml:space="preserve">Recipe Organizer – AI-Powered Recipe Management App </w:t>
+        <w:t>Recipe Organizer</w:t>
+      </w:r>
+      <w:r>
+        <w:rPr>
+          <w:rFonts w:ascii="Montserrat" w:eastAsia="Montserrat" w:hAnsi="Montserrat" w:cs="Montserrat"/>
+          <w:b/>
+          <w:bCs/>
+          <w:sz w:val="16"/>
+          <w:szCs w:val="16"/>
+        </w:rPr>
+        <w:t xml:space="preserve"> </w:t>
+      </w:r>
+      <w:r>
+        <w:rPr>
+          <w:rFonts w:ascii="Montserrat" w:eastAsia="Montserrat" w:hAnsi="Montserrat" w:cs="Montserrat"/>
+          <w:b/>
+          <w:bCs/>
+          <w:sz w:val="16"/>
+          <w:szCs w:val="16"/>
+        </w:rPr>
+        <w:t>•</w:t>
+      </w:r>
+      <w:r>
+        <w:rPr>
+          <w:rFonts w:ascii="Montserrat" w:eastAsia="Montserrat" w:hAnsi="Montserrat" w:cs="Montserrat"/>
+          <w:b/>
+          <w:bCs/>
+          <w:sz w:val="16"/>
+          <w:szCs w:val="16"/>
+        </w:rPr>
+        <w:t xml:space="preserve"> AI-Powered Recipe Management App </w:t>
       </w:r>
       <w:r>
         <w:rPr>
@@ -785,7 +815,37 @@
           <w:sz w:val="16"/>
           <w:szCs w:val="16"/>
         </w:rPr>
-        <w:t xml:space="preserve"> – API Orchestration Tool </w:t>
+        <w:t xml:space="preserve"> </w:t>
+      </w:r>
+      <w:r>
+        <w:rPr>
+          <w:rFonts w:ascii="Montserrat" w:eastAsia="Montserrat" w:hAnsi="Montserrat" w:cs="Montserrat"/>
+          <w:b/>
+          <w:bCs/>
+          <w:sz w:val="16"/>
+          <w:szCs w:val="16"/>
+        </w:rPr>
+        <w:t>•</w:t>
+      </w:r>
+      <w:r>
+        <w:rPr>
+          <w:rFonts w:ascii="Montserrat" w:eastAsia="Montserrat" w:hAnsi="Montserrat" w:cs="Montserrat"/>
+          <w:b/>
+          <w:bCs/>
+          <w:sz w:val="16"/>
+          <w:szCs w:val="16"/>
+        </w:rPr>
+        <w:t xml:space="preserve"> </w:t>
+      </w:r>
+      <w:r>
+        <w:rPr>
+          <w:rFonts w:ascii="Montserrat" w:eastAsia="Montserrat" w:hAnsi="Montserrat" w:cs="Montserrat"/>
+          <w:b/>
+          <w:bCs/>
+          <w:sz w:val="16"/>
+          <w:szCs w:val="16"/>
+        </w:rPr>
+        <w:t xml:space="preserve">API Orchestration Tool </w:t>
       </w:r>
       <w:r>
         <w:rPr>
@@ -979,15 +1039,16 @@
           <w:szCs w:val="16"/>
         </w:rPr>
         <w:tab/>
-        <w:t xml:space="preserve"> </w:t>
-      </w:r>
-      <w:r>
-        <w:rPr>
-          <w:rFonts w:ascii="Montserrat" w:eastAsia="Montserrat" w:hAnsi="Montserrat" w:cs="Montserrat"/>
-          <w:sz w:val="16"/>
-          <w:szCs w:val="16"/>
-        </w:rPr>
-        <w:t>Seattle, WA • 11/2023 - 03/2024</w:t>
+      </w:r>
+      <w:r>
+        <w:rPr>
+          <w:rFonts w:ascii="Montserrat" w:eastAsia="Montserrat" w:hAnsi="Montserrat" w:cs="Montserrat"/>
+          <w:b/>
+          <w:bCs/>
+          <w:sz w:val="16"/>
+          <w:szCs w:val="16"/>
+        </w:rPr>
+        <w:t xml:space="preserve"> Seattle, WA • 11/2023 - 03/2024</w:t>
       </w:r>
     </w:p>
     <w:p>

</xml_diff>